<commit_message>
WhiteBoard Update - 2026-05-01 19:22:31
</commit_message>
<xml_diff>
--- a/A2 Essen und Mahlzeiten/Mahlzeiten_Uebung_A2.docx
+++ b/A2 Essen und Mahlzeiten/Mahlzeiten_Uebung_A2.docx
@@ -791,7 +791,7 @@
                 <w:sz w:val="22"/>
                 <w:szCs w:val="22"/>
               </w:rPr>
-              <w:t>warm essen</w:t>
+              <w:t>das Schnitzel / Schnitzel</w:t>
             </w:r>
           </w:p>
         </w:tc>
@@ -808,15 +808,19 @@
           <w:p>
             <w:pPr>
               <w:pStyle w:val="Normal"/>
-              <w:rPr/>
-            </w:pPr>
-            <w:r>
-              <w:rPr>
-                <w:rFonts w:eastAsia="Arial" w:cs="Arial" w:ascii="Arial" w:hAnsi="Arial"/>
-                <w:sz w:val="22"/>
-                <w:szCs w:val="22"/>
-              </w:rPr>
-              <w:t>to eat a hot meal</w:t>
+              <w:rPr>
+                <w:rFonts w:ascii="Arial" w:hAnsi="Arial"/>
+                <w:sz w:val="22"/>
+                <w:szCs w:val="22"/>
+              </w:rPr>
+            </w:pPr>
+            <w:r>
+              <w:rPr>
+                <w:rFonts w:ascii="Arial" w:hAnsi="Arial"/>
+                <w:sz w:val="22"/>
+                <w:szCs w:val="22"/>
+              </w:rPr>
+              <w:t>schnitzel</w:t>
             </w:r>
           </w:p>
         </w:tc>
@@ -844,6 +848,58 @@
                 <w:sz w:val="22"/>
                 <w:szCs w:val="22"/>
               </w:rPr>
+              <w:t>warm essen</w:t>
+            </w:r>
+          </w:p>
+        </w:tc>
+        <w:tc>
+          <w:tcPr>
+            <w:tcW w:w="4680" w:type="dxa"/>
+            <w:tcBorders>
+              <w:top w:val="single" w:sz="2" w:space="0" w:color="999999"/>
+              <w:start w:val="single" w:sz="2" w:space="0" w:color="999999"/>
+              <w:bottom w:val="single" w:sz="2" w:space="0" w:color="999999"/>
+              <w:end w:val="single" w:sz="2" w:space="0" w:color="999999"/>
+            </w:tcBorders>
+          </w:tcPr>
+          <w:p>
+            <w:pPr>
+              <w:pStyle w:val="Normal"/>
+              <w:rPr/>
+            </w:pPr>
+            <w:r>
+              <w:rPr>
+                <w:rFonts w:eastAsia="Arial" w:cs="Arial" w:ascii="Arial" w:hAnsi="Arial"/>
+                <w:sz w:val="22"/>
+                <w:szCs w:val="22"/>
+              </w:rPr>
+              <w:t>to eat a hot meal</w:t>
+            </w:r>
+          </w:p>
+        </w:tc>
+      </w:tr>
+      <w:tr>
+        <w:trPr/>
+        <w:tc>
+          <w:tcPr>
+            <w:tcW w:w="4680" w:type="dxa"/>
+            <w:tcBorders>
+              <w:start w:val="single" w:sz="2" w:space="0" w:color="999999"/>
+              <w:bottom w:val="single" w:sz="2" w:space="0" w:color="999999"/>
+              <w:end w:val="single" w:sz="2" w:space="0" w:color="999999"/>
+            </w:tcBorders>
+          </w:tcPr>
+          <w:p>
+            <w:pPr>
+              <w:pStyle w:val="Normal"/>
+              <w:rPr/>
+            </w:pPr>
+            <w:r>
+              <w:rPr>
+                <w:rFonts w:eastAsia="Arial" w:cs="Arial" w:ascii="Arial" w:hAnsi="Arial"/>
+                <w:sz w:val="22"/>
+                <w:szCs w:val="22"/>
+              </w:rPr>
               <w:t>kalt essen</w:t>
             </w:r>
           </w:p>
@@ -852,7 +908,6 @@
           <w:tcPr>
             <w:tcW w:w="4680" w:type="dxa"/>
             <w:tcBorders>
-              <w:top w:val="single" w:sz="2" w:space="0" w:color="999999"/>
               <w:start w:val="single" w:sz="2" w:space="0" w:color="999999"/>
               <w:bottom w:val="single" w:sz="2" w:space="0" w:color="999999"/>
               <w:end w:val="single" w:sz="2" w:space="0" w:color="999999"/>
@@ -1970,6 +2025,7 @@
     <w:qFormat/>
     <w:pPr>
       <w:widowControl/>
+      <w:suppressAutoHyphens w:val="true"/>
       <w:bidi w:val="0"/>
       <w:spacing w:before="0" w:after="0"/>
       <w:jc w:val="start"/>
@@ -1985,7 +2041,7 @@
   </w:style>
   <w:style w:type="paragraph" w:styleId="Heading1">
     <w:name w:val="heading 1"/>
-    <w:basedOn w:val="berschrift"/>
+    <w:basedOn w:val="berschriftuser"/>
     <w:qFormat/>
     <w:pPr/>
     <w:rPr>
@@ -1996,7 +2052,7 @@
   </w:style>
   <w:style w:type="paragraph" w:styleId="Heading2">
     <w:name w:val="heading 2"/>
-    <w:basedOn w:val="berschrift"/>
+    <w:basedOn w:val="berschriftuser"/>
     <w:qFormat/>
     <w:pPr/>
     <w:rPr>
@@ -2007,7 +2063,7 @@
   </w:style>
   <w:style w:type="paragraph" w:styleId="Heading3">
     <w:name w:val="heading 3"/>
-    <w:basedOn w:val="berschrift"/>
+    <w:basedOn w:val="berschriftuser"/>
     <w:qFormat/>
     <w:pPr/>
     <w:rPr>
@@ -2018,7 +2074,7 @@
   </w:style>
   <w:style w:type="paragraph" w:styleId="Heading4">
     <w:name w:val="heading 4"/>
-    <w:basedOn w:val="berschrift"/>
+    <w:basedOn w:val="berschriftuser"/>
     <w:qFormat/>
     <w:pPr/>
     <w:rPr>
@@ -2029,7 +2085,7 @@
   </w:style>
   <w:style w:type="paragraph" w:styleId="Heading5">
     <w:name w:val="heading 5"/>
-    <w:basedOn w:val="berschrift"/>
+    <w:basedOn w:val="berschriftuser"/>
     <w:qFormat/>
     <w:pPr/>
     <w:rPr>
@@ -2038,7 +2094,7 @@
   </w:style>
   <w:style w:type="paragraph" w:styleId="Heading6">
     <w:name w:val="heading 6"/>
-    <w:basedOn w:val="berschrift"/>
+    <w:basedOn w:val="berschriftuser"/>
     <w:qFormat/>
     <w:pPr/>
     <w:rPr>
@@ -2054,11 +2110,18 @@
       <w:u w:val="single"/>
     </w:rPr>
   </w:style>
-  <w:style w:type="character" w:styleId="Funotenzeichen">
-    <w:name w:val="Fußnotenzeichen"/>
+  <w:style w:type="character" w:styleId="Funotenzeichenuser">
+    <w:name w:val="Fußnotenzeichen (user)"/>
     <w:uiPriority w:val="99"/>
     <w:semiHidden/>
     <w:unhideWhenUsed/>
+    <w:qFormat/>
+    <w:rPr>
+      <w:vertAlign w:val="superscript"/>
+    </w:rPr>
+  </w:style>
+  <w:style w:type="character" w:styleId="Funotenzeichen">
+    <w:name w:val="Fußnotenzeichen"/>
     <w:qFormat/>
     <w:rPr>
       <w:vertAlign w:val="superscript"/>
@@ -2081,11 +2144,18 @@
       <w:szCs w:val="20"/>
     </w:rPr>
   </w:style>
-  <w:style w:type="character" w:styleId="Endnotenzeichen">
-    <w:name w:val="Endnotenzeichen"/>
+  <w:style w:type="character" w:styleId="Endnotenzeichenuser">
+    <w:name w:val="Endnotenzeichen (user)"/>
     <w:uiPriority w:val="99"/>
     <w:semiHidden/>
     <w:unhideWhenUsed/>
+    <w:qFormat/>
+    <w:rPr>
+      <w:vertAlign w:val="superscript"/>
+    </w:rPr>
+  </w:style>
+  <w:style w:type="character" w:styleId="Endnotenzeichen">
+    <w:name w:val="Endnotenzeichen"/>
     <w:qFormat/>
     <w:rPr>
       <w:vertAlign w:val="superscript"/>
@@ -2167,9 +2237,35 @@
       <w:rFonts w:cs="Lucida Sans"/>
     </w:rPr>
   </w:style>
+  <w:style w:type="paragraph" w:styleId="berschriftuser">
+    <w:name w:val="Überschrift (user)"/>
+    <w:basedOn w:val="Normal"/>
+    <w:next w:val="BodyText"/>
+    <w:qFormat/>
+    <w:pPr>
+      <w:keepNext w:val="true"/>
+      <w:spacing w:before="240" w:after="120"/>
+    </w:pPr>
+    <w:rPr>
+      <w:rFonts w:ascii="Liberation Sans" w:hAnsi="Liberation Sans" w:eastAsia="Microsoft YaHei" w:cs="Lucida Sans"/>
+      <w:sz w:val="28"/>
+      <w:szCs w:val="28"/>
+    </w:rPr>
+  </w:style>
+  <w:style w:type="paragraph" w:styleId="Verzeichnisuser">
+    <w:name w:val="Verzeichnis (user)"/>
+    <w:basedOn w:val="Normal"/>
+    <w:qFormat/>
+    <w:pPr>
+      <w:suppressLineNumbers/>
+    </w:pPr>
+    <w:rPr>
+      <w:rFonts w:cs="Lucida Sans"/>
+    </w:rPr>
+  </w:style>
   <w:style w:type="paragraph" w:styleId="Title">
     <w:name w:val="Title"/>
-    <w:basedOn w:val="berschrift"/>
+    <w:basedOn w:val="berschriftuser"/>
     <w:qFormat/>
     <w:pPr/>
     <w:rPr>
@@ -2182,6 +2278,7 @@
     <w:qFormat/>
     <w:pPr>
       <w:widowControl/>
+      <w:suppressAutoHyphens w:val="true"/>
       <w:bidi w:val="0"/>
       <w:spacing w:before="0" w:after="0"/>
       <w:jc w:val="start"/>
@@ -2202,6 +2299,7 @@
     <w:qFormat/>
     <w:pPr>
       <w:widowControl/>
+      <w:suppressAutoHyphens w:val="true"/>
       <w:bidi w:val="0"/>
       <w:spacing w:before="0" w:after="0"/>
       <w:jc w:val="start"/>
@@ -2243,6 +2341,29 @@
     <w:rPr>
       <w:sz w:val="20"/>
       <w:szCs w:val="20"/>
+    </w:rPr>
+  </w:style>
+  <w:style w:type="paragraph" w:styleId="Tabelleninhalt">
+    <w:name w:val="Tabelleninhalt"/>
+    <w:basedOn w:val="Normal"/>
+    <w:qFormat/>
+    <w:pPr>
+      <w:widowControl w:val="false"/>
+      <w:suppressLineNumbers/>
+    </w:pPr>
+    <w:rPr/>
+  </w:style>
+  <w:style w:type="paragraph" w:styleId="Tabellenberschrift">
+    <w:name w:val="Tabellenüberschrift"/>
+    <w:basedOn w:val="Tabelleninhalt"/>
+    <w:qFormat/>
+    <w:pPr>
+      <w:suppressLineNumbers/>
+      <w:jc w:val="center"/>
+    </w:pPr>
+    <w:rPr>
+      <w:b/>
+      <w:bCs/>
     </w:rPr>
   </w:style>
 </w:styles>

</xml_diff>